<commit_message>
Schedule and Dress code update
</commit_message>
<xml_diff>
--- a/public/docs/dresscode.docx
+++ b/public/docs/dresscode.docx
@@ -14,12 +14,12 @@
     </w:p>
     <w:p>
       <w:r>
-        <w:t xml:space="preserve">Boys / Male Awardees:</w:t>
+        <w:t xml:space="preserve">Boys / Male Candidates:</w:t>
       </w:r>
     </w:p>
     <w:p>
       <w:r>
-        <w:t xml:space="preserve">- Plain White or Off-White Kurta Pyjama or Kurta Dhoti.</w:t>
+        <w:t xml:space="preserve">- Traditional Kurta Pyjama preferably white or off white color.</w:t>
       </w:r>
     </w:p>
     <w:p>
@@ -39,12 +39,12 @@
     </w:p>
     <w:p>
       <w:r>
-        <w:t xml:space="preserve">Girls / Female Awardees:</w:t>
+        <w:t xml:space="preserve">Girls / Female Candidates:</w:t>
       </w:r>
     </w:p>
     <w:p>
       <w:r>
-        <w:t xml:space="preserve">- Plain White or Off-White Salwar Kurta or Traditional Saree.</w:t>
+        <w:t xml:space="preserve">- Kurta Salwar or Saree preferably white or off white color.</w:t>
       </w:r>
     </w:p>
     <w:p>

</xml_diff>